<commit_message>
docs(ieee-paper): update front matter with final title, 3-author affiliation block, abstract, and index terms
</commit_message>
<xml_diff>
--- a/docs/ieee_paper_final__dasan__v3.docx
+++ b/docs/ieee_paper_final__dasan__v3.docx
@@ -4,23 +4,6 @@
   <w:body>
     <w:p>
       <w:pPr>
-        <w:pStyle w:val="Heading1"/>
-        <w:jc w:val="center"/>
-      </w:pPr>
-      <w:r>
-        <w:t>MASTER IEEE RESEARCH PAPER MANUSCRIPT</w:t>
-      </w:r>
-    </w:p>
-    <w:p>
-      <w:pPr>
-        <w:pStyle w:val="Heading2"/>
-      </w:pPr>
-      <w:r>
-        <w:t>NewsAI / NISE: Autonomous News Intelligence, Event Clustering, and Social Syndication Engine</w:t>
-      </w:r>
-    </w:p>
-    <w:p>
-      <w:pPr>
         <w:jc w:val="center"/>
       </w:pPr>
       <w:r>
@@ -36,7 +19,7 @@
         <w:jc w:val="center"/>
       </w:pPr>
       <w:r>
-        <w:t>NISE: A Hybrid Two-Stage Autonomous News Intelligence and Event Clustering Platform with LLM-Driven Multi-Channel Social Syndication</w:t>
+        <w:t>A Cost-Aware Multi-Stage Event Clustering Pipeline for Automated News Aggregation and Social Media Distribution: Design, Deployment, and Empirical Trade-off Analysis</w:t>
       </w:r>
     </w:p>
     <w:p>
@@ -44,7 +27,7 @@
         <w:rPr>
           <w:b/>
         </w:rPr>
-        <w:t>Jayadasan R</w:t>
+        <w:t>Jayadasan S¹, Jason Peniel Raj S¹, Dr. D. Menaga¹</w:t>
       </w:r>
       <w:r>
         <w:t xml:space="preserve">  </w:t>
@@ -52,28 +35,12 @@
     </w:p>
     <w:p>
       <w:r>
-        <w:t xml:space="preserve">Department of Computer Science and Engineering  </w:t>
+        <w:t xml:space="preserve">¹Department of Computer Science and Engineering, St. Joseph's Institute of Technology, Chennai, Tamil Nadu, India  </w:t>
       </w:r>
     </w:p>
     <w:p>
       <w:r>
-        <w:t xml:space="preserve">Jayadasan777 / NEWS-AI-AGGREGATOR Project  </w:t>
-      </w:r>
-    </w:p>
-    <w:p>
-      <w:r>
-        <w:t xml:space="preserve">Email: jayadasan777@github.com  </w:t>
-      </w:r>
-    </w:p>
-    <w:p>
-      <w:pPr>
-        <w:jc w:val="center"/>
-      </w:pPr>
-      <w:r>
-        <w:rPr>
-          <w:color w:val="969696"/>
-        </w:rPr>
-        <w:t>─────── ❖ ───────</w:t>
+        <w:t xml:space="preserve">{jayadasanjai, jasonpenielraj}@gmail.com, menaga@stjosephstechnology.ac.in  </w:t>
       </w:r>
     </w:p>
     <w:p>
@@ -86,246 +53,18 @@
     </w:p>
     <w:p>
       <w:r>
-        <w:t>The exponential growth of digital journalism has created a fundamental information processing challenge: while global news volume expands continuously, information density per reader declines due to widespread multi-outlet redundancy. International news agencies—including Reuters, Associated Press (AP), Bloomberg, BBC News, and CNBC—frequently publish between three and eight separate dispatches regarding identical real-world events within narrow temporal windows. This yields fragmented user experiences and forces readers to digest repetitive content across disparate platforms. Simultaneously, raw content scraping introduces copyright infringement risks, necessitating automated editorial transformation designed to reduce copyright exposure (a legally unsettled area, not a guaranteed exemption) prior to multi-channel distribution.</w:t>
+        <w:t>The exponential growth of digital journalism has produced a fundamental information-processing challenge: international wire agencies routinely publish three to eight independent dispatches describing the same real-world event within narrow temporal windows, causing redundant coverage while raw content scraping introduces copyright exposure. Existing approaches present distinct trade-offs: purely lexical deduplication fails on synonym-rich or periphrastic headlines sharing zero token overlap; dense embedding clustering requires GPU infrastructure infeasible for lightweight deployment; and direct pairwise LLM verification scales poorly. This paper presents NISE, a deployed hybrid multi-stage event-clustering pipeline combining a lexical pre-filter (Jaccard and character n-gram similarity), a multi-evidence fusion score (EFSA), and LLM verification reserved only for candidates surviving these filters, augmented by a publisher credibility mechanism (DPCS) and an experimental lightweight local semantic embedding gate. On a curated 45-pair, 12-domain benchmark, the deployed two-stage baseline achieves 73.33% accuracy and 50.00% F1-score while reducing LLM inference calls by 75.56%; EFSA+DPCS matches this accuracy at a further efficiency gain (77.78% call reduction), while an experimental semantic gate achieves the strongest overall performance (88.89% accuracy, 76.47% recall, 83.87% F1-score). We report a full cost/accuracy Pareto comparison across five strategies, an empirical LLM-provider migration case study demonstrating recall recovery through iterative prompt refinement, and an honest characterization of DPCS's non-uniform benefit across operating points. The complete pipeline, including autonomous multi-channel social media distribution, was verified operating end-to-end in a live deployment.</w:t>
       </w:r>
     </w:p>
     <w:p>
       <w:r>
-        <w:t>Existing news aggregation solutions present severe operational trade-offs. Keyword-matching pipelines using TF-IDF or isolated unigram metrics fail on synonym-rich headlines sharing zero word overlaps. Dense vector embedding techniques paired with GPU-dependent clustering algorithms (e.g., UMAP, HDBSCAN) require heavy hardware infrastructure, making low-resource deployment infeasible. Proprietary LLM pipelines impose high per-inference API costs, lack open algorithmic transparency, and fail to provide automated hallucination verification guardrails.</w:t>
-      </w:r>
-    </w:p>
-    <w:p>
-      <w:r>
-        <w:t xml:space="preserve">This paper presents the design, implementation, and empirical evaluation of </w:t>
-      </w:r>
-      <w:r>
         <w:rPr>
           <w:b/>
         </w:rPr>
-        <w:t>NISE</w:t>
-      </w:r>
-      <w:r>
-        <w:t xml:space="preserve"> (News Intelligence and Synthesis Engine), a deployed hybrid clustering and distribution pipeline combining established lexical pre-filtering and LLM verification techniques. NISE continuously ingests live RSS wire feeds from 21 streams across 14 multi-domain sectors, executes pre-LLM multi-layer deduplication locks (exact URL, title string, and MD5 headline digest hashing), synthesizes 150-word editorial summaries via Meta Llama 3.1-8B on Groq Language Processing Units (LPUs), and clusters multi-source coverage into corroborated event nodes.</w:t>
-      </w:r>
-    </w:p>
-    <w:p>
-      <w:r>
-        <w:t>Event clustering is driven by a two-stage hybrid pipeline: Stage 1a evaluates local unigram Jaccard similarity (</w:t>
-      </w:r>
-      <w:r>
-        <w:rPr>
-          <w:rFonts w:ascii="Cambria Math" w:hAnsi="Cambria Math"/>
-          <w:i/>
-        </w:rPr>
-        <w:t>\tau_J = 0.12</w:t>
-      </w:r>
-      <w:r>
-        <w:t>), while Stage 1b computes character 3-gram TF-IDF vector cosine similarity (</w:t>
-      </w:r>
-      <w:r>
-        <w:rPr>
-          <w:rFonts w:ascii="Cambria Math" w:hAnsi="Cambria Math"/>
-          <w:i/>
-        </w:rPr>
-        <w:t>\tau_C = 0.25</w:t>
-      </w:r>
-      <w:r>
-        <w:t>) to capture synonym-rich headline pairs that share zero unigrams. Pairs passing Stage 1 advance to Stage 2 zero-shot neural verification via Llama 3 (</w:t>
-      </w:r>
-      <w:r>
-        <w:rPr>
-          <w:rFonts w:ascii="Consolas" w:hAnsi="Consolas"/>
-          <w:color w:val="B42828"/>
-          <w:sz w:val="19"/>
-        </w:rPr>
-        <w:t>isSameEvent</w:t>
-      </w:r>
-      <w:r>
-        <w:t xml:space="preserve">). On a curated </w:t>
-      </w:r>
-      <w:r>
-        <w:rPr>
-          <w:rFonts w:ascii="Cambria Math" w:hAnsi="Cambria Math"/>
-          <w:i/>
-        </w:rPr>
-        <w:t>N=45</w:t>
-      </w:r>
-      <w:r>
-        <w:t xml:space="preserve"> ground-truth benchmark dataset across 12 domains, the deployed two-stage production system achieves </w:t>
-      </w:r>
-      <w:r>
-        <w:rPr>
-          <w:b/>
-        </w:rPr>
-        <w:t>73.33% Accuracy</w:t>
-      </w:r>
-      <w:r>
-        <w:t xml:space="preserve">, </w:t>
-      </w:r>
-      <w:r>
-        <w:rPr>
-          <w:b/>
-        </w:rPr>
-        <w:t>85.71% Precision</w:t>
-      </w:r>
-      <w:r>
-        <w:t xml:space="preserve">, </w:t>
-      </w:r>
-      <w:r>
-        <w:rPr>
-          <w:b/>
-        </w:rPr>
-        <w:t>35.29% Recall</w:t>
-      </w:r>
-      <w:r>
-        <w:t xml:space="preserve">, and </w:t>
-      </w:r>
-      <w:r>
-        <w:rPr>
-          <w:b/>
-        </w:rPr>
-        <w:t>50.00% F1-Score</w:t>
-      </w:r>
-      <w:r>
-        <w:t xml:space="preserve">, while reducing LLM API calls by </w:t>
-      </w:r>
-      <w:r>
-        <w:rPr>
-          <w:b/>
-        </w:rPr>
-        <w:t>75.56%</w:t>
-      </w:r>
-      <w:r>
-        <w:t xml:space="preserve"> (making 11 of 45 LLM invocations).</w:t>
-      </w:r>
-    </w:p>
-    <w:p>
-      <w:r>
-        <w:t>To address the diagnosed recall gap caused by journalist periphrasis, brand metonymy, and acronym variations, we present an experimental, tested-but-not-deployed 3-stage enhancement adding a local CPU sentence transformer embedding gate (</w:t>
-      </w:r>
-      <w:r>
-        <w:rPr>
-          <w:rFonts w:ascii="Consolas" w:hAnsi="Consolas"/>
-          <w:color w:val="B42828"/>
-          <w:sz w:val="19"/>
-        </w:rPr>
-        <w:t>Xenova/all-MiniLM-L6-v2</w:t>
-      </w:r>
-      <w:r>
-        <w:t xml:space="preserve">, running in ~1.8 seconds for all 45 pairs). At semantic threshold </w:t>
-      </w:r>
-      <w:r>
-        <w:rPr>
-          <w:rFonts w:ascii="Cambria Math" w:hAnsi="Cambria Math"/>
-          <w:i/>
-        </w:rPr>
-        <w:t>T_{\text{sem}} = 0.40</w:t>
-      </w:r>
-      <w:r>
-        <w:t xml:space="preserve">, this 3-stage pipeline recovers recall to </w:t>
-      </w:r>
-      <w:r>
-        <w:rPr>
-          <w:b/>
-        </w:rPr>
-        <w:t>76.47%</w:t>
-      </w:r>
-      <w:r>
-        <w:t xml:space="preserve"> (+41.18 percentage points over production baseline) with </w:t>
-      </w:r>
-      <w:r>
-        <w:rPr>
-          <w:b/>
-        </w:rPr>
-        <w:t>88.89% Accuracy</w:t>
-      </w:r>
-      <w:r>
-        <w:t xml:space="preserve"> and </w:t>
-      </w:r>
-      <w:r>
-        <w:rPr>
-          <w:b/>
-        </w:rPr>
-        <w:t>83.87% F1-Score</w:t>
-      </w:r>
-      <w:r>
-        <w:t xml:space="preserve"> while preserving a </w:t>
-      </w:r>
-      <w:r>
-        <w:rPr>
-          <w:b/>
-        </w:rPr>
-        <w:t>53.33% LLM call reduction</w:t>
-      </w:r>
-      <w:r>
-        <w:t xml:space="preserve"> (21 of 45 LLM calls). We separately report the </w:t>
-      </w:r>
-      <w:r>
-        <w:rPr>
-          <w:b/>
-        </w:rPr>
-        <w:t>LLM-only ceiling (unconditional Llama 3 on all 45 pairs, an upper bound rather than the deployed system)</w:t>
-      </w:r>
-      <w:r>
-        <w:t xml:space="preserve"> at </w:t>
-      </w:r>
-      <w:r>
-        <w:rPr>
-          <w:b/>
-        </w:rPr>
-        <w:t>97.78% Accuracy</w:t>
-      </w:r>
-      <w:r>
-        <w:t xml:space="preserve">, </w:t>
-      </w:r>
-      <w:r>
-        <w:rPr>
-          <w:b/>
-        </w:rPr>
-        <w:t>94.44% Precision</w:t>
-      </w:r>
-      <w:r>
-        <w:t xml:space="preserve">, </w:t>
-      </w:r>
-      <w:r>
-        <w:rPr>
-          <w:b/>
-        </w:rPr>
-        <w:t>100.00% Recall</w:t>
-      </w:r>
-      <w:r>
-        <w:t xml:space="preserve">, and </w:t>
-      </w:r>
-      <w:r>
-        <w:rPr>
-          <w:b/>
-        </w:rPr>
-        <w:t>97.14% F1-Score</w:t>
-      </w:r>
-      <w:r>
-        <w:t>. NISE incorporates a Dynamic Source Stance Detection Agent, an Iterative Hallucination Reflection Guardrail, an Evergreen Content Recirculation Engine, and a Webhook Self-Healing Retry Engine with 1-hour staggered drip-feeding scheduling. The system is deployed with a 3D Cosmic Glassmorphism WebGL interface (Three.js / React Three Fiber) and an interactive Social Studio dashboard (</w:t>
-      </w:r>
-      <w:r>
-        <w:rPr>
-          <w:rFonts w:ascii="Consolas" w:hAnsi="Consolas"/>
-          <w:color w:val="B42828"/>
-          <w:sz w:val="19"/>
-        </w:rPr>
-        <w:t>/studio</w:t>
-      </w:r>
-      <w:r>
-        <w:t>).</w:t>
-      </w:r>
-    </w:p>
-    <w:p>
-      <w:r>
-        <w:rPr>
-          <w:b/>
-        </w:rPr>
-        <w:t>Index Terms</w:t>
-      </w:r>
-      <w:r>
-        <w:t xml:space="preserve"> — Autonomous News Aggregation, Event Clustering, Large Language Models, Jaccard Similarity, Character N-Gram Cosine Similarity, Factuality Reflection Loop, Webhook Self-Healing, React Three Fiber, Groq LPUs, MERN Stack.</w:t>
+        <w:t>Index Terms —</w:t>
+      </w:r>
+      <w:r>
+        <w:t xml:space="preserve"> Event Clustering, Hybrid Lexical-Semantic Gating, LLM Verification, Publisher Credibility Scoring, News Deduplication, Cost-Accuracy Trade-off Analysis, Multi-Source Evidence Fusion, Automated News Aggregation</w:t>
       </w:r>
     </w:p>
     <w:p>

</xml_diff>

<commit_message>
docs(ieee-paper): remove unverified millisecond latency claims from Table IX and Section 5.4 asymptotic analysis
</commit_message>
<xml_diff>
--- a/docs/ieee_paper_final__dasan__v3.docx
+++ b/docs/ieee_paper_final__dasan__v3.docx
@@ -9286,10 +9286,10 @@
                 <w:rFonts w:ascii="Cambria Math" w:hAnsi="Cambria Math"/>
                 <w:i/>
               </w:rPr>
-              <w:t>\sim 1.5</w:t>
-            </w:r>
-            <w:r>
-              <w:t>s per pair)</w:t>
+              <w:t>\approx 2.99</w:t>
+            </w:r>
+            <w:r>
+              <w:t>s mean measured, Section 5.4)</w:t>
             </w:r>
           </w:p>
         </w:tc>
@@ -9358,17 +9358,7 @@
             </w:pPr>
             <w:r/>
             <w:r>
-              <w:t>Negligible (</w:t>
-            </w:r>
-            <w:r>
-              <w:rPr>
-                <w:rFonts w:ascii="Cambria Math" w:hAnsi="Cambria Math"/>
-                <w:i/>
-              </w:rPr>
-              <w:t>&lt;0.05</w:t>
-            </w:r>
-            <w:r>
-              <w:t>ms)</w:t>
+              <w:t>Negligible relative to LLM cost (no GPU/network dependency)</w:t>
             </w:r>
           </w:p>
         </w:tc>
@@ -9437,17 +9427,7 @@
             </w:pPr>
             <w:r/>
             <w:r>
-              <w:t>Fast Path (</w:t>
-            </w:r>
-            <w:r>
-              <w:rPr>
-                <w:rFonts w:ascii="Cambria Math" w:hAnsi="Cambria Math"/>
-                <w:i/>
-              </w:rPr>
-              <w:t>&lt;0.20</w:t>
-            </w:r>
-            <w:r>
-              <w:t>ms)</w:t>
+              <w:t>Negligible relative to LLM cost (no GPU/network dependency)</w:t>
             </w:r>
           </w:p>
         </w:tc>
@@ -9516,17 +9496,17 @@
             </w:pPr>
             <w:r/>
             <w:r>
-              <w:t>Constant (</w:t>
+              <w:t>Negligible relative to LLM cost (</w:t>
             </w:r>
             <w:r>
               <w:rPr>
                 <w:rFonts w:ascii="Cambria Math" w:hAnsi="Cambria Math"/>
                 <w:i/>
               </w:rPr>
-              <w:t>&lt;0.01</w:t>
-            </w:r>
-            <w:r>
-              <w:t>ms)</w:t>
+              <w:t>\mathcal{O}(1)</w:t>
+            </w:r>
+            <w:r>
+              <w:t xml:space="preserve"> scalar update)</w:t>
             </w:r>
           </w:p>
         </w:tc>
@@ -9700,17 +9680,17 @@
         <w:t>\mathcal{O}(K \cdot |V|)</w:t>
       </w:r>
       <w:r>
-        <w:t xml:space="preserve"> token/n-gram operations, executing in </w:t>
+        <w:t xml:space="preserve"> token/n-gram operations — several orders of magnitude cheaper than the </w:t>
       </w:r>
       <w:r>
         <w:rPr>
           <w:rFonts w:ascii="Cambria Math" w:hAnsi="Cambria Math"/>
           <w:i/>
         </w:rPr>
-        <w:t>&lt; 0.20\text{ ms}</w:t>
-      </w:r>
-      <w:r>
-        <w:t xml:space="preserve"> per candidate pair on standard CPU hardware.</w:t>
+        <w:t>\approx 2.99</w:t>
+      </w:r>
+      <w:r>
+        <w:t>-second mean LLM verification latency measured in this section, though the exact per-operation cost was not independently benchmarked and is not reported as a specific figure here.</w:t>
       </w:r>
     </w:p>
     <w:p>

</xml_diff>

<commit_message>
docs(ieee-paper): integrate Section 5.6 (LLM Migration) and Section 5.7 (DPCS Threshold Sensitivity Sweep with Table XI)
</commit_message>
<xml_diff>
--- a/docs/ieee_paper_final__dasan__v3.docx
+++ b/docs/ieee_paper_final__dasan__v3.docx
@@ -27,7 +27,7 @@
         <w:rPr>
           <w:b/>
         </w:rPr>
-        <w:t>Jayadasan S¹, Jason Peniel Raj S¹, Dr. D. Menaga¹</w:t>
+        <w:t>Mr. Jayadasan S - Author</w:t>
       </w:r>
       <w:r>
         <w:t xml:space="preserve">  </w:t>
@@ -35,12 +35,84 @@
     </w:p>
     <w:p>
       <w:r>
-        <w:t xml:space="preserve">¹Department of Computer Science and Engineering, St. Joseph's Institute of Technology, Chennai, Tamil Nadu, India  </w:t>
+        <w:t xml:space="preserve">Department of Computer Science and Engineering  </w:t>
       </w:r>
     </w:p>
     <w:p>
       <w:r>
-        <w:t xml:space="preserve">{jayadasanjai, jasonpenielraj}@gmail.com, menaga@stjosephstechnology.ac.in  </w:t>
+        <w:t xml:space="preserve">St. Joseph's Institute of Technology  </w:t>
+      </w:r>
+    </w:p>
+    <w:p>
+      <w:r>
+        <w:t xml:space="preserve">Chennai, Tamil Nadu, India  </w:t>
+      </w:r>
+    </w:p>
+    <w:p>
+      <w:r>
+        <w:t xml:space="preserve">jayadasanjai@gmail.com  </w:t>
+      </w:r>
+    </w:p>
+    <w:p>
+      <w:r>
+        <w:rPr>
+          <w:b/>
+        </w:rPr>
+        <w:t>Mr. Jason Peniel Raj S - Co-Author</w:t>
+      </w:r>
+      <w:r>
+        <w:t xml:space="preserve">  </w:t>
+      </w:r>
+    </w:p>
+    <w:p>
+      <w:r>
+        <w:t xml:space="preserve">Department of Computer Science and Engineering  </w:t>
+      </w:r>
+    </w:p>
+    <w:p>
+      <w:r>
+        <w:t xml:space="preserve">St. Joseph's Institute of Technology  </w:t>
+      </w:r>
+    </w:p>
+    <w:p>
+      <w:r>
+        <w:t xml:space="preserve">Chennai, Tamil Nadu, India  </w:t>
+      </w:r>
+    </w:p>
+    <w:p>
+      <w:r>
+        <w:t xml:space="preserve">jasonpenielraj@gmail.com  </w:t>
+      </w:r>
+    </w:p>
+    <w:p>
+      <w:r>
+        <w:rPr>
+          <w:b/>
+        </w:rPr>
+        <w:t>Dr. D. Menaga B.E., M.E., Ph.D. - Mentor</w:t>
+      </w:r>
+      <w:r>
+        <w:t xml:space="preserve">  </w:t>
+      </w:r>
+    </w:p>
+    <w:p>
+      <w:r>
+        <w:t xml:space="preserve">Department of Computer Science and Engineering  </w:t>
+      </w:r>
+    </w:p>
+    <w:p>
+      <w:r>
+        <w:t xml:space="preserve">St. Joseph's Institute of Technology  </w:t>
+      </w:r>
+    </w:p>
+    <w:p>
+      <w:r>
+        <w:t xml:space="preserve">Chennai, Tamil Nadu, India  </w:t>
+      </w:r>
+    </w:p>
+    <w:p>
+      <w:r>
+        <w:t xml:space="preserve">menaga@stjosephstechnology.ac.in  </w:t>
       </w:r>
     </w:p>
     <w:p>
@@ -91,48 +163,64 @@
         <w:pStyle w:val="Heading3"/>
       </w:pPr>
       <w:r>
-        <w:t>1.1 Problem Motivation &amp; Industry Challenge</w:t>
+        <w:t>1.1 Background</w:t>
       </w:r>
     </w:p>
     <w:p>
       <w:r>
-        <w:t xml:space="preserve">Modern digital news consumption suffers from </w:t>
-      </w:r>
-      <w:r>
-        <w:rPr>
-          <w:b/>
-        </w:rPr>
-        <w:t>Informational Hyper-Fragmentation</w:t>
-      </w:r>
-      <w:r>
-        <w:t xml:space="preserve">. When breaking news occurs—such as a central bank interest rate shift, a geopolitical crisis update, or an artificial intelligence model release—dozens of global newsrooms simultaneously publish articles covering the exact same event. </w:t>
+        <w:t>The past decade has seen an exponential increase in the volume of digital journalism, driven by the proliferation of online news agencies, RSS syndication, and real-time wire services. Automated news aggregation platforms now ingest content from dozens of publishers simultaneously, spanning domains from politics and finance to technology and sports. This growth has been accompanied by increasing interest in applying artificial intelligence, and more recently large language models (LLMs), to automatically summarize, categorize, and distribute this content at scale. However, the same event is frequently reported independently by multiple outlets within a narrow time window, resulting in substantial redundant coverage that automated systems must reconcile.</w:t>
       </w:r>
     </w:p>
     <w:p>
       <w:pPr>
-        <w:spacing w:before="80" w:after="120"/>
-        <w:ind w:left="360"/>
+        <w:pStyle w:val="Heading3"/>
       </w:pPr>
       <w:r>
-        <w:rPr>
-          <w:rFonts w:ascii="Consolas" w:hAnsi="Consolas"/>
-          <w:color w:val="1E1E1E"/>
-          <w:sz w:val="17"/>
-        </w:rPr>
-        <w:t xml:space="preserve">                                ┌──► Reuters ("Fed Cuts Interest Rates by 50bps")</w:t>
-        <w:br/>
-        <w:t xml:space="preserve">                                │</w:t>
-        <w:br/>
-        <w:t>[Real-World Incident] ─────────┼──► Bloomberg ("Jerome Powell Announces Rate Cut")</w:t>
-        <w:br/>
-        <w:t>(Fed Rate Decision)            │</w:t>
-        <w:br/>
-        <w:t xml:space="preserve">                                └──► BBC News ("US Central Bank Lowers Borrowing Costs")</w:t>
+        <w:t>1.2 Motivation</w:t>
       </w:r>
     </w:p>
     <w:p>
       <w:r>
-        <w:t>For digital news platforms and consumers, this creates three critical vulnerabilities:</w:t>
+        <w:t>Reconciling this redundancy is not merely a matter of user convenience — it carries real computational and legal costs. Verifying whether two headlines describe the same event via a large language model is comparatively expensive at scale, particularly when performed exhaustively across all candidate pairs. Dense embedding-based similarity methods reduce this cost but typically require GPU-backed infrastructure that is unavailable in lightweight or academic deployment settings. Separately, automated rewriting of scraped news content raises copyright considerations that remain legally unsettled, and manual multi-channel distribution of synthesized content does not scale with ingestion volume. These constraints motivate a system that is simultaneously accurate, computationally economical, and deployable without specialized hardware.</w:t>
+      </w:r>
+    </w:p>
+    <w:p>
+      <w:pPr>
+        <w:pStyle w:val="Heading3"/>
+      </w:pPr>
+      <w:r>
+        <w:t>1.3 Research Gap</w:t>
+      </w:r>
+    </w:p>
+    <w:p>
+      <w:r>
+        <w:t>Purely lexical deduplication methods (TF-IDF, unigram Jaccard similarity) are computationally inexpensive but fail on synonym-rich or periphrastic headline pairs sharing zero token overlap. Dense embedding-based clustering (e.g., Sentence-BERT with UMAP/HDBSCAN) resolves this limitation but assumes computational infrastructure unavailable in many deployment contexts. Recent LLM-assisted event-clustering approaches (Tarekegn et al., 2024; Nakshatri et al., 2023) demonstrate that large language models can effectively verify candidate event matches, but do not characterize the cost/accuracy trade-off of lightweight pre-filtering strategies, nor evaluate a fully deployed end-to-end system inclusive of distribution. Existing systems therefore do not jointly optimize for clustering accuracy and inference cost under realistic deployment constraints. Therefore, there is a need for a system that combines inexpensive pre-filtering with selective LLM verification, and that is evaluated not only on classification accuracy but on the resulting computational trade-offs.</w:t>
+      </w:r>
+    </w:p>
+    <w:p>
+      <w:pPr>
+        <w:pStyle w:val="Heading3"/>
+      </w:pPr>
+      <w:r>
+        <w:t>1.4 Problem Statement</w:t>
+      </w:r>
+    </w:p>
+    <w:p>
+      <w:r>
+        <w:t>Although large language models can accurately determine whether two news articles describe the same real-world event, they suffer from high per-inference cost when applied exhaustively across all candidate article pairs in a continuously ingested stream. Therefore, this paper addresses the problem of designing a multi-stage event-clustering pipeline that minimizes the number of LLM verification calls required, while empirically characterizing the resulting trade-off between classification accuracy and computational cost across multiple candidate strategies.</w:t>
+      </w:r>
+    </w:p>
+    <w:p>
+      <w:pPr>
+        <w:pStyle w:val="Heading3"/>
+      </w:pPr>
+      <w:r>
+        <w:t>1.5 Objectives</w:t>
+      </w:r>
+    </w:p>
+    <w:p>
+      <w:r>
+        <w:t>The objectives of this research are:</w:t>
       </w:r>
     </w:p>
     <w:p>
@@ -140,13 +228,7 @@
         <w:pStyle w:val="ListNumber"/>
       </w:pPr>
       <w:r>
-        <w:rPr>
-          <w:b/>
-        </w:rPr>
-        <w:t>Redundancy &amp; Cognitive Fatigue:</w:t>
-      </w:r>
-      <w:r>
-        <w:t xml:space="preserve"> Readers are forced to scan multiple articles describing the exact same event without knowing whether new information is present.</w:t>
+        <w:t>To design a cost-aware, multi-stage event-clustering gate combining lexical, multi-evidence, and LLM-based verification.</w:t>
       </w:r>
     </w:p>
     <w:p>
@@ -154,13 +236,7 @@
         <w:pStyle w:val="ListNumber"/>
       </w:pPr>
       <w:r>
-        <w:rPr>
-          <w:b/>
-        </w:rPr>
-        <w:t>Copyright Infringement Exposure:</w:t>
-      </w:r>
-      <w:r>
-        <w:t xml:space="preserve"> Scraping raw text from original publishers and presenting verbatim excerpts violates intellectual property laws. News engines require an autonomous, transformative synthesis layer designed to reduce copyright exposure (a legally unsettled area, not a guaranteed exemption).</w:t>
+        <w:t>To empirically characterize the accuracy/cost trade-off of this gate against lexical-only, LLM-only, and semantic-embedding-based alternatives.</w:t>
       </w:r>
     </w:p>
     <w:p>
@@ -168,13 +244,23 @@
         <w:pStyle w:val="ListNumber"/>
       </w:pPr>
       <w:r>
-        <w:rPr>
-          <w:b/>
-        </w:rPr>
-        <w:t>Distribution Overhead &amp; Rate Limits:</w:t>
-      </w:r>
-      <w:r>
-        <w:t xml:space="preserve"> Publishing updates across multi-channel social networks manually requires immense labor. Naive automated scripts frequently trigger API rate-limits or spam flags when batch dispatches occur simultaneously.</w:t>
+        <w:t>To diagnose and explain the specific failure modes of lexical pre-filtering rather than reporting aggregate accuracy alone.</w:t>
+      </w:r>
+    </w:p>
+    <w:p>
+      <w:pPr>
+        <w:pStyle w:val="ListNumber"/>
+      </w:pPr>
+      <w:r>
+        <w:t>To verify the resulting pipeline as a deployed, operating system rather than a purely theoretical design.</w:t>
+      </w:r>
+    </w:p>
+    <w:p>
+      <w:pPr>
+        <w:pStyle w:val="ListNumber"/>
+      </w:pPr>
+      <w:r>
+        <w:t>To evaluate a publisher-credibility-based extension to the clustering gate and honestly characterize its operating conditions.</w:t>
       </w:r>
     </w:p>
     <w:p>
@@ -182,104 +268,7 @@
         <w:pStyle w:val="Heading3"/>
       </w:pPr>
       <w:r>
-        <w:t>1.2 Limitations of Existing Approaches</w:t>
-      </w:r>
-    </w:p>
-    <w:p>
-      <w:r>
-        <w:t>Prior news processing systems attempt to solve parts of this pipeline, but fall short in operational feasibility:</w:t>
-      </w:r>
-    </w:p>
-    <w:p>
-      <w:pPr>
-        <w:pStyle w:val="ListBullet"/>
-      </w:pPr>
-      <w:r>
-        <w:rPr>
-          <w:b/>
-        </w:rPr>
-        <w:t>Lexical TF-IDF / Pure Jaccard Matching:</w:t>
-      </w:r>
-      <w:r>
-        <w:t xml:space="preserve"> Keyword-matching systems calculate token overlaps. However, when outlets use completely different vocabulary (e.g., </w:t>
-      </w:r>
-      <w:r>
-        <w:rPr>
-          <w:i/>
-        </w:rPr>
-        <w:t>"Congress clears legislation"</w:t>
-      </w:r>
-      <w:r>
-        <w:t xml:space="preserve"> vs. </w:t>
-      </w:r>
-      <w:r>
-        <w:rPr>
-          <w:i/>
-        </w:rPr>
-        <w:t>"House passes bill"</w:t>
-      </w:r>
-      <w:r>
-        <w:t>), lexical models yield zero overlap, generating high false-negative rates.</w:t>
-      </w:r>
-    </w:p>
-    <w:p>
-      <w:pPr>
-        <w:pStyle w:val="ListBullet"/>
-      </w:pPr>
-      <w:r>
-        <w:rPr>
-          <w:b/>
-        </w:rPr>
-        <w:t>GPU-Dense Vector Embeddings (UMAP / HDBSCAN):</w:t>
-      </w:r>
-      <w:r>
-        <w:t xml:space="preserve"> Systems using dense sentence transformers require dedicated GPU hardware for vector calculations and complex vector databases (e.g., Pinecone, Milvus), imposing high infrastructure costs.</w:t>
-      </w:r>
-    </w:p>
-    <w:p>
-      <w:pPr>
-        <w:pStyle w:val="ListBullet"/>
-      </w:pPr>
-      <w:r>
-        <w:rPr>
-          <w:b/>
-        </w:rPr>
-        <w:t>Proprietary LLM Direct Verification:</w:t>
-      </w:r>
-      <w:r>
-        <w:t xml:space="preserve"> Submitting every candidate headline pair directly to proprietary LLM endpoints (such as GPT-4) scales at </w:t>
-      </w:r>
-      <w:r>
-        <w:rPr>
-          <w:rFonts w:ascii="Cambria Math" w:hAnsi="Cambria Math"/>
-          <w:i/>
-        </w:rPr>
-        <w:t>\mathcal{O}(N \times M)</w:t>
-      </w:r>
-      <w:r>
-        <w:t xml:space="preserve"> cost and latency, causing rate-limit bottlenecks during major breaking news cycles.</w:t>
-      </w:r>
-    </w:p>
-    <w:p>
-      <w:pPr>
-        <w:pStyle w:val="ListBullet"/>
-      </w:pPr>
-      <w:r>
-        <w:rPr>
-          <w:b/>
-        </w:rPr>
-        <w:t>Lack of Factuality Guardrails:</w:t>
-      </w:r>
-      <w:r>
-        <w:t xml:space="preserve"> Standard LLM text summarization frequently suffers from hallucinations—generating unsupported numbers, false named entities, or inaccurate causal claims.</w:t>
-      </w:r>
-    </w:p>
-    <w:p>
-      <w:pPr>
-        <w:pStyle w:val="Heading3"/>
-      </w:pPr>
-      <w:r>
-        <w:t>1.3 System Contributions &amp; Novel Algorithmic Innovations</w:t>
+        <w:t>1.6 System Contributions &amp; Novel Algorithmic Innovations</w:t>
       </w:r>
     </w:p>
     <w:p>
@@ -556,7 +545,7 @@
         <w:t>N=45</w:t>
       </w:r>
       <w:r>
-        <w:t xml:space="preserve"> benchmark dataset, identifying that journalist periphrasis, brand metonymy, acronyms, and agency aliases account for 8 out of 11 gate misses (72.73%, Rows 4–11 of Table III), while the remaining 3 rows (1–3) involve high vocabulary divergence or numerical phrasing variation rather than naming/aliasing patterns. We evaluate an experimental local CPU sentence transformer gate (</w:t>
+        <w:t xml:space="preserve"> benchmark dataset, identifying that journalist periphrasis, brand metonymy, acronyms, and agency aliases account for 8 out of 11 gate misses (72.73%, Rows 4–11 of Table X), while the remaining 3 rows (1–3) involve high vocabulary divergence or numerical phrasing variation rather than naming/aliasing patterns. We evaluate an experimental local CPU sentence transformer gate (</w:t>
       </w:r>
       <w:r>
         <w:rPr>
@@ -11703,6 +11692,1478 @@
       </w:r>
       <w:r>
         <w:t>.</w:t>
+      </w:r>
+    </w:p>
+    <w:p>
+      <w:pPr>
+        <w:jc w:val="center"/>
+      </w:pPr>
+      <w:r>
+        <w:rPr>
+          <w:color w:val="969696"/>
+        </w:rPr>
+        <w:t>─────── ❖ ───────</w:t>
+      </w:r>
+    </w:p>
+    <w:p>
+      <w:pPr>
+        <w:pStyle w:val="Heading3"/>
+      </w:pPr>
+      <w:r>
+        <w:t>5.6 Empirical Case Study: LLM-Provider Migration &amp; Iterative Prompt Refinement</w:t>
+      </w:r>
+    </w:p>
+    <w:p>
+      <w:r>
+        <w:t xml:space="preserve">During early development, the event-verification stage relied on proprietary Gemini endpoints. Following migration to Meta's open-weight </w:t>
+      </w:r>
+      <w:r>
+        <w:rPr>
+          <w:rFonts w:ascii="Consolas" w:hAnsi="Consolas"/>
+          <w:color w:val="B42828"/>
+          <w:sz w:val="19"/>
+        </w:rPr>
+        <w:t>llama-3.1-8b-instant</w:t>
+      </w:r>
+      <w:r>
+        <w:t xml:space="preserve"> served on Groq LPUs, initial zero-shot verification exhibited a severe recall regression, dropping to </w:t>
+      </w:r>
+      <w:r>
+        <w:rPr>
+          <w:b/>
+        </w:rPr>
+        <w:t>17.65% Recall</w:t>
+      </w:r>
+      <w:r>
+        <w:t xml:space="preserve"> (identifying only 3 of 17 </w:t>
+      </w:r>
+      <w:r>
+        <w:rPr>
+          <w:rFonts w:ascii="Consolas" w:hAnsi="Consolas"/>
+          <w:color w:val="B42828"/>
+          <w:sz w:val="19"/>
+        </w:rPr>
+        <w:t>SAME</w:t>
+      </w:r>
+      <w:r>
+        <w:t xml:space="preserve"> pairs) as the open-weight model strictly interpreted syntactic differences as distinct events.</w:t>
+      </w:r>
+    </w:p>
+    <w:p>
+      <w:r>
+        <w:t xml:space="preserve">To recover recall without abandoning open-weight inference hardware, we conducted three iterations of prompt refinement on the Stage 2 </w:t>
+      </w:r>
+      <w:r>
+        <w:rPr>
+          <w:rFonts w:ascii="Consolas" w:hAnsi="Consolas"/>
+          <w:color w:val="B42828"/>
+          <w:sz w:val="19"/>
+        </w:rPr>
+        <w:t>isSameEvent</w:t>
+      </w:r>
+      <w:r>
+        <w:t xml:space="preserve"> prompt:</w:t>
+      </w:r>
+    </w:p>
+    <w:p>
+      <w:pPr>
+        <w:pStyle w:val="ListNumber"/>
+      </w:pPr>
+      <w:r>
+        <w:rPr>
+          <w:b/>
+        </w:rPr>
+        <w:t>Iteration 1 (Few-Shot Domain Exemplars):</w:t>
+      </w:r>
+      <w:r>
+        <w:t xml:space="preserve"> Injecting two domain-specific headline pairs (Tech and Finance) into the system prompt increased recall from </w:t>
+      </w:r>
+      <w:r>
+        <w:rPr>
+          <w:b/>
+        </w:rPr>
+        <w:t>17.65% to 23.53%</w:t>
+      </w:r>
+      <w:r>
+        <w:t xml:space="preserve"> (4 of 17 </w:t>
+      </w:r>
+      <w:r>
+        <w:rPr>
+          <w:rFonts w:ascii="Consolas" w:hAnsi="Consolas"/>
+          <w:color w:val="B42828"/>
+          <w:sz w:val="19"/>
+        </w:rPr>
+        <w:t>SAME</w:t>
+      </w:r>
+      <w:r>
+        <w:t xml:space="preserve"> pairs).</w:t>
+      </w:r>
+    </w:p>
+    <w:p>
+      <w:pPr>
+        <w:pStyle w:val="ListNumber"/>
+      </w:pPr>
+      <w:r>
+        <w:rPr>
+          <w:b/>
+        </w:rPr>
+        <w:t>Iteration 2 (Negative Pair &amp; Aliasing Instructions):</w:t>
+      </w:r>
+      <w:r>
+        <w:t xml:space="preserve"> Explicitly instructing the model to disregard entity phrasing variations, acronyms, and journalist periphrasis (e.g., </w:t>
+      </w:r>
+      <w:r>
+        <w:rPr>
+          <w:i/>
+        </w:rPr>
+        <w:t>"Do NOT classify as DIFFERENT solely due to entity alias variations"</w:t>
+      </w:r>
+      <w:r>
+        <w:t xml:space="preserve">) recovered recall to </w:t>
+      </w:r>
+      <w:r>
+        <w:rPr>
+          <w:b/>
+        </w:rPr>
+        <w:t>35.29%</w:t>
+      </w:r>
+      <w:r>
+        <w:t xml:space="preserve"> (6 of 17 </w:t>
+      </w:r>
+      <w:r>
+        <w:rPr>
+          <w:rFonts w:ascii="Consolas" w:hAnsi="Consolas"/>
+          <w:color w:val="B42828"/>
+          <w:sz w:val="19"/>
+        </w:rPr>
+        <w:t>SAME</w:t>
+      </w:r>
+      <w:r>
+        <w:t xml:space="preserve"> pairs) while preserving high precision (</w:t>
+      </w:r>
+      <w:r>
+        <w:rPr>
+          <w:b/>
+        </w:rPr>
+        <w:t>85.71%</w:t>
+      </w:r>
+      <w:r>
+        <w:t xml:space="preserve">, 1 false positive out of 28 </w:t>
+      </w:r>
+      <w:r>
+        <w:rPr>
+          <w:rFonts w:ascii="Consolas" w:hAnsi="Consolas"/>
+          <w:color w:val="B42828"/>
+          <w:sz w:val="19"/>
+        </w:rPr>
+        <w:t>DIFFERENT</w:t>
+      </w:r>
+      <w:r>
+        <w:t xml:space="preserve"> pairs).</w:t>
+      </w:r>
+    </w:p>
+    <w:p>
+      <w:pPr>
+        <w:pStyle w:val="ListNumber"/>
+      </w:pPr>
+      <w:r>
+        <w:rPr>
+          <w:b/>
+        </w:rPr>
+        <w:t>Iteration 3 (Structured JSON Output Locking):</w:t>
+      </w:r>
+      <w:r>
+        <w:t xml:space="preserve"> Constraining output schema to strict JSON boolean responses (</w:t>
+      </w:r>
+      <w:r>
+        <w:rPr>
+          <w:rFonts w:ascii="Consolas" w:hAnsi="Consolas"/>
+          <w:color w:val="B42828"/>
+          <w:sz w:val="19"/>
+        </w:rPr>
+        <w:t>{"isSameEvent": true|false}</w:t>
+      </w:r>
+      <w:r>
+        <w:t>) eliminated malformed generation errors, stabilizing overall pipeline execution.</w:t>
+      </w:r>
+    </w:p>
+    <w:p>
+      <w:r>
+        <w:t>This empirical case study demonstrates that migrating from proprietary endpoints to open-weight LLMs on LPU hardware requires iterative prompt engineering to bridge zero-shot reasoning gaps in event verification.</w:t>
+      </w:r>
+    </w:p>
+    <w:p>
+      <w:pPr>
+        <w:jc w:val="center"/>
+      </w:pPr>
+      <w:r>
+        <w:rPr>
+          <w:color w:val="969696"/>
+        </w:rPr>
+        <w:t>─────── ❖ ───────</w:t>
+      </w:r>
+    </w:p>
+    <w:p>
+      <w:pPr>
+        <w:pStyle w:val="Heading3"/>
+      </w:pPr>
+      <w:r>
+        <w:t>5.7 Threshold Sensitivity Sweep &amp; Characterization of DPCS Non-Uniform Suppression</w:t>
+      </w:r>
+    </w:p>
+    <w:p>
+      <w:r>
+        <w:t xml:space="preserve">To fulfill the promise of an honest operational characterization of Dynamic Publisher Credibility Scoring (DPCS), we executed a comprehensive threshold sensitivity sweep across EFSA thresholds </w:t>
+      </w:r>
+      <w:r>
+        <w:rPr>
+          <w:rFonts w:ascii="Cambria Math" w:hAnsi="Cambria Math"/>
+          <w:i/>
+        </w:rPr>
+        <w:t>\tau \in [0.15, 0.35]</w:t>
+      </w:r>
+      <w:r>
+        <w:t xml:space="preserve"> using </w:t>
+      </w:r>
+      <w:r>
+        <w:rPr>
+          <w:rFonts w:ascii="Consolas" w:hAnsi="Consolas"/>
+          <w:color w:val="B42828"/>
+          <w:sz w:val="19"/>
+        </w:rPr>
+        <w:t>runEfsaDpcsEvaluation.js</w:t>
+      </w:r>
+      <w:r>
+        <w:t>. Table XI presents the comparative performance of EFSA alone versus EFSA integrated with DPCS credibility weighting (</w:t>
+      </w:r>
+      <w:r>
+        <w:rPr>
+          <w:rFonts w:ascii="Cambria Math" w:hAnsi="Cambria Math"/>
+          <w:i/>
+        </w:rPr>
+        <w:t>S_{\text{EFSA+DPCS}} = S_{\text{EFSA}} \times [0.8 + 0.2 \cdot C_{\text{pub}} / 100]</w:t>
+      </w:r>
+      <w:r>
+        <w:t>).</w:t>
+      </w:r>
+    </w:p>
+    <w:p>
+      <w:r>
+        <w:rPr>
+          <w:b/>
+        </w:rPr>
+        <w:t>TABLE XI: EFSA VS. EFSA+DPCS THRESHOLD SENSITIVITY SWEEP ($N=45$)</w:t>
+      </w:r>
+    </w:p>
+    <w:tbl>
+      <w:tblPr>
+        <w:tblStyle w:val="TableGrid"/>
+        <w:tblW w:type="auto" w:w="0"/>
+        <w:jc w:val="center"/>
+        <w:tblLook w:firstColumn="1" w:firstRow="1" w:lastColumn="0" w:lastRow="0" w:noHBand="0" w:noVBand="1" w:val="04A0"/>
+      </w:tblPr>
+      <w:tblGrid>
+        <w:gridCol w:w="1170"/>
+        <w:gridCol w:w="1170"/>
+        <w:gridCol w:w="1170"/>
+        <w:gridCol w:w="1170"/>
+        <w:gridCol w:w="1170"/>
+        <w:gridCol w:w="1170"/>
+        <w:gridCol w:w="1170"/>
+        <w:gridCol w:w="1170"/>
+      </w:tblGrid>
+      <w:tr>
+        <w:tc>
+          <w:tcPr>
+            <w:tcW w:type="dxa" w:w="1170"/>
+            <w:shd w:fill="F0F4F8"/>
+          </w:tcPr>
+          <w:p>
+            <w:pPr>
+              <w:spacing w:before="60" w:after="60"/>
+            </w:pPr>
+            <w:r>
+              <w:rPr>
+                <w:b/>
+              </w:rPr>
+            </w:r>
+            <w:r>
+              <w:rPr>
+                <w:b/>
+              </w:rPr>
+              <w:t>Operating Threshold (</w:t>
+            </w:r>
+            <w:r>
+              <w:rPr>
+                <w:rFonts w:ascii="Cambria Math" w:hAnsi="Cambria Math"/>
+                <w:b/>
+                <w:i/>
+              </w:rPr>
+              <w:t>\tau</w:t>
+            </w:r>
+            <w:r>
+              <w:rPr>
+                <w:b/>
+              </w:rPr>
+              <w:t>)</w:t>
+            </w:r>
+          </w:p>
+        </w:tc>
+        <w:tc>
+          <w:tcPr>
+            <w:tcW w:type="dxa" w:w="1170"/>
+            <w:shd w:fill="F0F4F8"/>
+          </w:tcPr>
+          <w:p>
+            <w:pPr>
+              <w:spacing w:before="60" w:after="60"/>
+            </w:pPr>
+            <w:r>
+              <w:rPr>
+                <w:b/>
+              </w:rPr>
+            </w:r>
+            <w:r>
+              <w:rPr>
+                <w:b/>
+              </w:rPr>
+              <w:t>Strategy</w:t>
+            </w:r>
+          </w:p>
+        </w:tc>
+        <w:tc>
+          <w:tcPr>
+            <w:tcW w:type="dxa" w:w="1170"/>
+            <w:shd w:fill="F0F4F8"/>
+          </w:tcPr>
+          <w:p>
+            <w:pPr>
+              <w:spacing w:before="60" w:after="60"/>
+            </w:pPr>
+            <w:r>
+              <w:rPr>
+                <w:b/>
+              </w:rPr>
+            </w:r>
+            <w:r>
+              <w:rPr>
+                <w:b/>
+              </w:rPr>
+              <w:t>Accuracy</w:t>
+            </w:r>
+          </w:p>
+        </w:tc>
+        <w:tc>
+          <w:tcPr>
+            <w:tcW w:type="dxa" w:w="1170"/>
+            <w:shd w:fill="F0F4F8"/>
+          </w:tcPr>
+          <w:p>
+            <w:pPr>
+              <w:spacing w:before="60" w:after="60"/>
+            </w:pPr>
+            <w:r>
+              <w:rPr>
+                <w:b/>
+              </w:rPr>
+            </w:r>
+            <w:r>
+              <w:rPr>
+                <w:b/>
+              </w:rPr>
+              <w:t>Precision</w:t>
+            </w:r>
+          </w:p>
+        </w:tc>
+        <w:tc>
+          <w:tcPr>
+            <w:tcW w:type="dxa" w:w="1170"/>
+            <w:shd w:fill="F0F4F8"/>
+          </w:tcPr>
+          <w:p>
+            <w:pPr>
+              <w:spacing w:before="60" w:after="60"/>
+            </w:pPr>
+            <w:r>
+              <w:rPr>
+                <w:b/>
+              </w:rPr>
+            </w:r>
+            <w:r>
+              <w:rPr>
+                <w:b/>
+              </w:rPr>
+              <w:t>Recall</w:t>
+            </w:r>
+          </w:p>
+        </w:tc>
+        <w:tc>
+          <w:tcPr>
+            <w:tcW w:type="dxa" w:w="1170"/>
+            <w:shd w:fill="F0F4F8"/>
+          </w:tcPr>
+          <w:p>
+            <w:pPr>
+              <w:spacing w:before="60" w:after="60"/>
+            </w:pPr>
+            <w:r>
+              <w:rPr>
+                <w:b/>
+              </w:rPr>
+            </w:r>
+            <w:r>
+              <w:rPr>
+                <w:b/>
+              </w:rPr>
+              <w:t>F1-Score</w:t>
+            </w:r>
+          </w:p>
+        </w:tc>
+        <w:tc>
+          <w:tcPr>
+            <w:tcW w:type="dxa" w:w="1170"/>
+            <w:shd w:fill="F0F4F8"/>
+          </w:tcPr>
+          <w:p>
+            <w:pPr>
+              <w:spacing w:before="60" w:after="60"/>
+            </w:pPr>
+            <w:r>
+              <w:rPr>
+                <w:b/>
+              </w:rPr>
+            </w:r>
+            <w:r>
+              <w:rPr>
+                <w:b/>
+              </w:rPr>
+              <w:t>LLM Calls</w:t>
+            </w:r>
+          </w:p>
+        </w:tc>
+        <w:tc>
+          <w:tcPr>
+            <w:tcW w:type="dxa" w:w="1170"/>
+            <w:shd w:fill="F0F4F8"/>
+          </w:tcPr>
+          <w:p>
+            <w:pPr>
+              <w:spacing w:before="60" w:after="60"/>
+            </w:pPr>
+            <w:r>
+              <w:rPr>
+                <w:b/>
+              </w:rPr>
+            </w:r>
+            <w:r>
+              <w:rPr>
+                <w:b/>
+              </w:rPr>
+              <w:t>Call Savings</w:t>
+            </w:r>
+          </w:p>
+        </w:tc>
+      </w:tr>
+      <w:tr>
+        <w:tc>
+          <w:tcPr>
+            <w:tcW w:type="dxa" w:w="1170"/>
+          </w:tcPr>
+          <w:p>
+            <w:pPr>
+              <w:spacing w:before="60" w:after="60"/>
+            </w:pPr>
+            <w:r/>
+            <w:r>
+              <w:rPr>
+                <w:b/>
+              </w:rPr>
+              <w:t>$\tau = 0.22$</w:t>
+            </w:r>
+            <w:r>
+              <w:t xml:space="preserve"> </w:t>
+            </w:r>
+            <w:r>
+              <w:rPr>
+                <w:i/>
+              </w:rPr>
+              <w:t>(Production)</w:t>
+            </w:r>
+          </w:p>
+        </w:tc>
+        <w:tc>
+          <w:tcPr>
+            <w:tcW w:type="dxa" w:w="1170"/>
+          </w:tcPr>
+          <w:p>
+            <w:pPr>
+              <w:spacing w:before="60" w:after="60"/>
+            </w:pPr>
+            <w:r/>
+            <w:r>
+              <w:rPr>
+                <w:b/>
+              </w:rPr>
+              <w:t>EFSA Alone</w:t>
+            </w:r>
+          </w:p>
+        </w:tc>
+        <w:tc>
+          <w:tcPr>
+            <w:tcW w:type="dxa" w:w="1170"/>
+          </w:tcPr>
+          <w:p>
+            <w:pPr>
+              <w:spacing w:before="60" w:after="60"/>
+            </w:pPr>
+            <w:r/>
+            <w:r>
+              <w:rPr>
+                <w:b/>
+              </w:rPr>
+              <w:t>73.33%</w:t>
+            </w:r>
+          </w:p>
+        </w:tc>
+        <w:tc>
+          <w:tcPr>
+            <w:tcW w:type="dxa" w:w="1170"/>
+          </w:tcPr>
+          <w:p>
+            <w:pPr>
+              <w:spacing w:before="60" w:after="60"/>
+            </w:pPr>
+            <w:r/>
+            <w:r>
+              <w:rPr>
+                <w:b/>
+              </w:rPr>
+              <w:t>85.71%</w:t>
+            </w:r>
+          </w:p>
+        </w:tc>
+        <w:tc>
+          <w:tcPr>
+            <w:tcW w:type="dxa" w:w="1170"/>
+          </w:tcPr>
+          <w:p>
+            <w:pPr>
+              <w:spacing w:before="60" w:after="60"/>
+            </w:pPr>
+            <w:r/>
+            <w:r>
+              <w:rPr>
+                <w:b/>
+              </w:rPr>
+              <w:t>35.29%</w:t>
+            </w:r>
+          </w:p>
+        </w:tc>
+        <w:tc>
+          <w:tcPr>
+            <w:tcW w:type="dxa" w:w="1170"/>
+          </w:tcPr>
+          <w:p>
+            <w:pPr>
+              <w:spacing w:before="60" w:after="60"/>
+            </w:pPr>
+            <w:r/>
+            <w:r>
+              <w:rPr>
+                <w:b/>
+              </w:rPr>
+              <w:t>50.00%</w:t>
+            </w:r>
+          </w:p>
+        </w:tc>
+        <w:tc>
+          <w:tcPr>
+            <w:tcW w:type="dxa" w:w="1170"/>
+          </w:tcPr>
+          <w:p>
+            <w:pPr>
+              <w:spacing w:before="60" w:after="60"/>
+            </w:pPr>
+            <w:r/>
+            <w:r>
+              <w:rPr>
+                <w:b/>
+              </w:rPr>
+              <w:t>13</w:t>
+            </w:r>
+          </w:p>
+        </w:tc>
+        <w:tc>
+          <w:tcPr>
+            <w:tcW w:type="dxa" w:w="1170"/>
+          </w:tcPr>
+          <w:p>
+            <w:pPr>
+              <w:spacing w:before="60" w:after="60"/>
+            </w:pPr>
+            <w:r/>
+            <w:r>
+              <w:rPr>
+                <w:b/>
+              </w:rPr>
+              <w:t>71.11%</w:t>
+            </w:r>
+          </w:p>
+        </w:tc>
+      </w:tr>
+      <w:tr>
+        <w:tc>
+          <w:tcPr>
+            <w:tcW w:type="dxa" w:w="1170"/>
+          </w:tcPr>
+          <w:p>
+            <w:pPr>
+              <w:spacing w:before="60" w:after="60"/>
+            </w:pPr>
+            <w:r/>
+            <w:r>
+              <w:rPr>
+                <w:b/>
+              </w:rPr>
+              <w:t>$\tau = 0.22$</w:t>
+            </w:r>
+            <w:r>
+              <w:t xml:space="preserve"> </w:t>
+            </w:r>
+            <w:r>
+              <w:rPr>
+                <w:i/>
+              </w:rPr>
+              <w:t>(Production)</w:t>
+            </w:r>
+          </w:p>
+        </w:tc>
+        <w:tc>
+          <w:tcPr>
+            <w:tcW w:type="dxa" w:w="1170"/>
+          </w:tcPr>
+          <w:p>
+            <w:pPr>
+              <w:spacing w:before="60" w:after="60"/>
+            </w:pPr>
+            <w:r/>
+            <w:r>
+              <w:rPr>
+                <w:b/>
+              </w:rPr>
+              <w:t>EFSA + DPCS</w:t>
+            </w:r>
+          </w:p>
+        </w:tc>
+        <w:tc>
+          <w:tcPr>
+            <w:tcW w:type="dxa" w:w="1170"/>
+          </w:tcPr>
+          <w:p>
+            <w:pPr>
+              <w:spacing w:before="60" w:after="60"/>
+            </w:pPr>
+            <w:r/>
+            <w:r>
+              <w:rPr>
+                <w:b/>
+              </w:rPr>
+              <w:t>73.33%</w:t>
+            </w:r>
+          </w:p>
+        </w:tc>
+        <w:tc>
+          <w:tcPr>
+            <w:tcW w:type="dxa" w:w="1170"/>
+          </w:tcPr>
+          <w:p>
+            <w:pPr>
+              <w:spacing w:before="60" w:after="60"/>
+            </w:pPr>
+            <w:r/>
+            <w:r>
+              <w:rPr>
+                <w:b/>
+              </w:rPr>
+              <w:t>85.71%</w:t>
+            </w:r>
+          </w:p>
+        </w:tc>
+        <w:tc>
+          <w:tcPr>
+            <w:tcW w:type="dxa" w:w="1170"/>
+          </w:tcPr>
+          <w:p>
+            <w:pPr>
+              <w:spacing w:before="60" w:after="60"/>
+            </w:pPr>
+            <w:r/>
+            <w:r>
+              <w:rPr>
+                <w:b/>
+              </w:rPr>
+              <w:t>35.29%</w:t>
+            </w:r>
+          </w:p>
+        </w:tc>
+        <w:tc>
+          <w:tcPr>
+            <w:tcW w:type="dxa" w:w="1170"/>
+          </w:tcPr>
+          <w:p>
+            <w:pPr>
+              <w:spacing w:before="60" w:after="60"/>
+            </w:pPr>
+            <w:r/>
+            <w:r>
+              <w:rPr>
+                <w:b/>
+              </w:rPr>
+              <w:t>50.00%</w:t>
+            </w:r>
+          </w:p>
+        </w:tc>
+        <w:tc>
+          <w:tcPr>
+            <w:tcW w:type="dxa" w:w="1170"/>
+          </w:tcPr>
+          <w:p>
+            <w:pPr>
+              <w:spacing w:before="60" w:after="60"/>
+            </w:pPr>
+            <w:r/>
+            <w:r>
+              <w:rPr>
+                <w:b/>
+              </w:rPr>
+              <w:t>10</w:t>
+            </w:r>
+          </w:p>
+        </w:tc>
+        <w:tc>
+          <w:tcPr>
+            <w:tcW w:type="dxa" w:w="1170"/>
+          </w:tcPr>
+          <w:p>
+            <w:pPr>
+              <w:spacing w:before="60" w:after="60"/>
+            </w:pPr>
+            <w:r/>
+            <w:r>
+              <w:rPr>
+                <w:b/>
+              </w:rPr>
+              <w:t>77.78%</w:t>
+            </w:r>
+          </w:p>
+        </w:tc>
+      </w:tr>
+      <w:tr>
+        <w:tc>
+          <w:tcPr>
+            <w:tcW w:type="dxa" w:w="1170"/>
+          </w:tcPr>
+          <w:p>
+            <w:pPr>
+              <w:spacing w:before="60" w:after="60"/>
+            </w:pPr>
+            <w:r/>
+            <w:r>
+              <w:rPr>
+                <w:b/>
+              </w:rPr>
+              <w:t>$\tau = 0.18$</w:t>
+            </w:r>
+            <w:r>
+              <w:t xml:space="preserve"> </w:t>
+            </w:r>
+            <w:r>
+              <w:rPr>
+                <w:i/>
+              </w:rPr>
+              <w:t>(High-Recall)</w:t>
+            </w:r>
+          </w:p>
+        </w:tc>
+        <w:tc>
+          <w:tcPr>
+            <w:tcW w:type="dxa" w:w="1170"/>
+          </w:tcPr>
+          <w:p>
+            <w:pPr>
+              <w:spacing w:before="60" w:after="60"/>
+            </w:pPr>
+            <w:r/>
+            <w:r>
+              <w:rPr>
+                <w:b/>
+              </w:rPr>
+              <w:t>EFSA Alone</w:t>
+            </w:r>
+          </w:p>
+        </w:tc>
+        <w:tc>
+          <w:tcPr>
+            <w:tcW w:type="dxa" w:w="1170"/>
+          </w:tcPr>
+          <w:p>
+            <w:pPr>
+              <w:spacing w:before="60" w:after="60"/>
+            </w:pPr>
+            <w:r/>
+            <w:r>
+              <w:rPr>
+                <w:b/>
+              </w:rPr>
+              <w:t>80.00%</w:t>
+            </w:r>
+          </w:p>
+        </w:tc>
+        <w:tc>
+          <w:tcPr>
+            <w:tcW w:type="dxa" w:w="1170"/>
+          </w:tcPr>
+          <w:p>
+            <w:pPr>
+              <w:spacing w:before="60" w:after="60"/>
+            </w:pPr>
+            <w:r/>
+            <w:r>
+              <w:rPr>
+                <w:b/>
+              </w:rPr>
+              <w:t>75.00%</w:t>
+            </w:r>
+          </w:p>
+        </w:tc>
+        <w:tc>
+          <w:tcPr>
+            <w:tcW w:type="dxa" w:w="1170"/>
+          </w:tcPr>
+          <w:p>
+            <w:pPr>
+              <w:spacing w:before="60" w:after="60"/>
+            </w:pPr>
+            <w:r/>
+            <w:r>
+              <w:rPr>
+                <w:b/>
+              </w:rPr>
+              <w:t>52.94%</w:t>
+            </w:r>
+          </w:p>
+        </w:tc>
+        <w:tc>
+          <w:tcPr>
+            <w:tcW w:type="dxa" w:w="1170"/>
+          </w:tcPr>
+          <w:p>
+            <w:pPr>
+              <w:spacing w:before="60" w:after="60"/>
+            </w:pPr>
+            <w:r/>
+            <w:r>
+              <w:rPr>
+                <w:b/>
+              </w:rPr>
+              <w:t>66.67%</w:t>
+            </w:r>
+          </w:p>
+        </w:tc>
+        <w:tc>
+          <w:tcPr>
+            <w:tcW w:type="dxa" w:w="1170"/>
+          </w:tcPr>
+          <w:p>
+            <w:pPr>
+              <w:spacing w:before="60" w:after="60"/>
+            </w:pPr>
+            <w:r/>
+            <w:r>
+              <w:rPr>
+                <w:b/>
+              </w:rPr>
+              <w:t>25</w:t>
+            </w:r>
+          </w:p>
+        </w:tc>
+        <w:tc>
+          <w:tcPr>
+            <w:tcW w:type="dxa" w:w="1170"/>
+          </w:tcPr>
+          <w:p>
+            <w:pPr>
+              <w:spacing w:before="60" w:after="60"/>
+            </w:pPr>
+            <w:r/>
+            <w:r>
+              <w:rPr>
+                <w:b/>
+              </w:rPr>
+              <w:t>44.44%</w:t>
+            </w:r>
+          </w:p>
+        </w:tc>
+      </w:tr>
+      <w:tr>
+        <w:tc>
+          <w:tcPr>
+            <w:tcW w:type="dxa" w:w="1170"/>
+          </w:tcPr>
+          <w:p>
+            <w:pPr>
+              <w:spacing w:before="60" w:after="60"/>
+            </w:pPr>
+            <w:r/>
+            <w:r>
+              <w:rPr>
+                <w:b/>
+              </w:rPr>
+              <w:t>$\tau = 0.18$</w:t>
+            </w:r>
+            <w:r>
+              <w:t xml:space="preserve"> </w:t>
+            </w:r>
+            <w:r>
+              <w:rPr>
+                <w:i/>
+              </w:rPr>
+              <w:t>(High-Recall)</w:t>
+            </w:r>
+          </w:p>
+        </w:tc>
+        <w:tc>
+          <w:tcPr>
+            <w:tcW w:type="dxa" w:w="1170"/>
+          </w:tcPr>
+          <w:p>
+            <w:pPr>
+              <w:spacing w:before="60" w:after="60"/>
+            </w:pPr>
+            <w:r/>
+            <w:r>
+              <w:rPr>
+                <w:b/>
+              </w:rPr>
+              <w:t>EFSA + DPCS</w:t>
+            </w:r>
+          </w:p>
+        </w:tc>
+        <w:tc>
+          <w:tcPr>
+            <w:tcW w:type="dxa" w:w="1170"/>
+          </w:tcPr>
+          <w:p>
+            <w:pPr>
+              <w:spacing w:before="60" w:after="60"/>
+            </w:pPr>
+            <w:r/>
+            <w:r>
+              <w:rPr>
+                <w:b/>
+              </w:rPr>
+              <w:t>75.56%</w:t>
+            </w:r>
+          </w:p>
+        </w:tc>
+        <w:tc>
+          <w:tcPr>
+            <w:tcW w:type="dxa" w:w="1170"/>
+          </w:tcPr>
+          <w:p>
+            <w:pPr>
+              <w:spacing w:before="60" w:after="60"/>
+            </w:pPr>
+            <w:r/>
+            <w:r>
+              <w:rPr>
+                <w:b/>
+              </w:rPr>
+              <w:t>77.78%</w:t>
+            </w:r>
+          </w:p>
+        </w:tc>
+        <w:tc>
+          <w:tcPr>
+            <w:tcW w:type="dxa" w:w="1170"/>
+          </w:tcPr>
+          <w:p>
+            <w:pPr>
+              <w:spacing w:before="60" w:after="60"/>
+            </w:pPr>
+            <w:r/>
+            <w:r>
+              <w:rPr>
+                <w:b/>
+              </w:rPr>
+              <w:t>41.18%</w:t>
+            </w:r>
+          </w:p>
+        </w:tc>
+        <w:tc>
+          <w:tcPr>
+            <w:tcW w:type="dxa" w:w="1170"/>
+          </w:tcPr>
+          <w:p>
+            <w:pPr>
+              <w:spacing w:before="60" w:after="60"/>
+            </w:pPr>
+            <w:r/>
+            <w:r>
+              <w:rPr>
+                <w:b/>
+              </w:rPr>
+              <w:t>53.85%</w:t>
+            </w:r>
+          </w:p>
+        </w:tc>
+        <w:tc>
+          <w:tcPr>
+            <w:tcW w:type="dxa" w:w="1170"/>
+          </w:tcPr>
+          <w:p>
+            <w:pPr>
+              <w:spacing w:before="60" w:after="60"/>
+            </w:pPr>
+            <w:r/>
+            <w:r>
+              <w:rPr>
+                <w:b/>
+              </w:rPr>
+              <w:t>22</w:t>
+            </w:r>
+          </w:p>
+        </w:tc>
+        <w:tc>
+          <w:tcPr>
+            <w:tcW w:type="dxa" w:w="1170"/>
+          </w:tcPr>
+          <w:p>
+            <w:pPr>
+              <w:spacing w:before="60" w:after="60"/>
+            </w:pPr>
+            <w:r/>
+            <w:r>
+              <w:rPr>
+                <w:b/>
+              </w:rPr>
+              <w:t>51.11%</w:t>
+            </w:r>
+          </w:p>
+        </w:tc>
+      </w:tr>
+      <w:tr>
+        <w:tc>
+          <w:tcPr>
+            <w:tcW w:type="dxa" w:w="1170"/>
+          </w:tcPr>
+          <w:p>
+            <w:pPr>
+              <w:spacing w:before="60" w:after="60"/>
+            </w:pPr>
+            <w:r/>
+            <w:r>
+              <w:rPr>
+                <w:b/>
+              </w:rPr>
+              <w:t>$\tau = 0.15$</w:t>
+            </w:r>
+            <w:r>
+              <w:t xml:space="preserve"> </w:t>
+            </w:r>
+            <w:r>
+              <w:rPr>
+                <w:i/>
+              </w:rPr>
+              <w:t>(Max-Recall)</w:t>
+            </w:r>
+          </w:p>
+        </w:tc>
+        <w:tc>
+          <w:tcPr>
+            <w:tcW w:type="dxa" w:w="1170"/>
+          </w:tcPr>
+          <w:p>
+            <w:pPr>
+              <w:spacing w:before="60" w:after="60"/>
+            </w:pPr>
+            <w:r/>
+            <w:r>
+              <w:rPr>
+                <w:b/>
+              </w:rPr>
+              <w:t>EFSA Alone</w:t>
+            </w:r>
+          </w:p>
+        </w:tc>
+        <w:tc>
+          <w:tcPr>
+            <w:tcW w:type="dxa" w:w="1170"/>
+          </w:tcPr>
+          <w:p>
+            <w:pPr>
+              <w:spacing w:before="60" w:after="60"/>
+            </w:pPr>
+            <w:r/>
+            <w:r>
+              <w:rPr>
+                <w:b/>
+              </w:rPr>
+              <w:t>82.22%</w:t>
+            </w:r>
+          </w:p>
+        </w:tc>
+        <w:tc>
+          <w:tcPr>
+            <w:tcW w:type="dxa" w:w="1170"/>
+          </w:tcPr>
+          <w:p>
+            <w:pPr>
+              <w:spacing w:before="60" w:after="60"/>
+            </w:pPr>
+            <w:r/>
+            <w:r>
+              <w:rPr>
+                <w:b/>
+              </w:rPr>
+              <w:t>71.43%</w:t>
+            </w:r>
+          </w:p>
+        </w:tc>
+        <w:tc>
+          <w:tcPr>
+            <w:tcW w:type="dxa" w:w="1170"/>
+          </w:tcPr>
+          <w:p>
+            <w:pPr>
+              <w:spacing w:before="60" w:after="60"/>
+            </w:pPr>
+            <w:r/>
+            <w:r>
+              <w:rPr>
+                <w:b/>
+              </w:rPr>
+              <w:t>58.82%</w:t>
+            </w:r>
+          </w:p>
+        </w:tc>
+        <w:tc>
+          <w:tcPr>
+            <w:tcW w:type="dxa" w:w="1170"/>
+          </w:tcPr>
+          <w:p>
+            <w:pPr>
+              <w:spacing w:before="60" w:after="60"/>
+            </w:pPr>
+            <w:r/>
+            <w:r>
+              <w:rPr>
+                <w:b/>
+              </w:rPr>
+              <w:t>71.43%</w:t>
+            </w:r>
+          </w:p>
+        </w:tc>
+        <w:tc>
+          <w:tcPr>
+            <w:tcW w:type="dxa" w:w="1170"/>
+          </w:tcPr>
+          <w:p>
+            <w:pPr>
+              <w:spacing w:before="60" w:after="60"/>
+            </w:pPr>
+            <w:r/>
+            <w:r>
+              <w:rPr>
+                <w:b/>
+              </w:rPr>
+              <w:t>31</w:t>
+            </w:r>
+          </w:p>
+        </w:tc>
+        <w:tc>
+          <w:tcPr>
+            <w:tcW w:type="dxa" w:w="1170"/>
+          </w:tcPr>
+          <w:p>
+            <w:pPr>
+              <w:spacing w:before="60" w:after="60"/>
+            </w:pPr>
+            <w:r/>
+            <w:r>
+              <w:rPr>
+                <w:b/>
+              </w:rPr>
+              <w:t>31.11%</w:t>
+            </w:r>
+          </w:p>
+        </w:tc>
+      </w:tr>
+      <w:tr>
+        <w:tc>
+          <w:tcPr>
+            <w:tcW w:type="dxa" w:w="1170"/>
+          </w:tcPr>
+          <w:p>
+            <w:pPr>
+              <w:spacing w:before="60" w:after="60"/>
+            </w:pPr>
+            <w:r/>
+            <w:r>
+              <w:rPr>
+                <w:b/>
+              </w:rPr>
+              <w:t>$\tau = 0.15$</w:t>
+            </w:r>
+            <w:r>
+              <w:t xml:space="preserve"> </w:t>
+            </w:r>
+            <w:r>
+              <w:rPr>
+                <w:i/>
+              </w:rPr>
+              <w:t>(Max-Recall)</w:t>
+            </w:r>
+          </w:p>
+        </w:tc>
+        <w:tc>
+          <w:tcPr>
+            <w:tcW w:type="dxa" w:w="1170"/>
+          </w:tcPr>
+          <w:p>
+            <w:pPr>
+              <w:spacing w:before="60" w:after="60"/>
+            </w:pPr>
+            <w:r/>
+            <w:r>
+              <w:rPr>
+                <w:b/>
+              </w:rPr>
+              <w:t>EFSA + DPCS</w:t>
+            </w:r>
+          </w:p>
+        </w:tc>
+        <w:tc>
+          <w:tcPr>
+            <w:tcW w:type="dxa" w:w="1170"/>
+          </w:tcPr>
+          <w:p>
+            <w:pPr>
+              <w:spacing w:before="60" w:after="60"/>
+            </w:pPr>
+            <w:r/>
+            <w:r>
+              <w:rPr>
+                <w:b/>
+              </w:rPr>
+              <w:t>77.78%</w:t>
+            </w:r>
+          </w:p>
+        </w:tc>
+        <w:tc>
+          <w:tcPr>
+            <w:tcW w:type="dxa" w:w="1170"/>
+          </w:tcPr>
+          <w:p>
+            <w:pPr>
+              <w:spacing w:before="60" w:after="60"/>
+            </w:pPr>
+            <w:r/>
+            <w:r>
+              <w:rPr>
+                <w:b/>
+              </w:rPr>
+              <w:t>72.73%</w:t>
+            </w:r>
+          </w:p>
+        </w:tc>
+        <w:tc>
+          <w:tcPr>
+            <w:tcW w:type="dxa" w:w="1170"/>
+          </w:tcPr>
+          <w:p>
+            <w:pPr>
+              <w:spacing w:before="60" w:after="60"/>
+            </w:pPr>
+            <w:r/>
+            <w:r>
+              <w:rPr>
+                <w:b/>
+              </w:rPr>
+              <w:t>47.06%</w:t>
+            </w:r>
+          </w:p>
+        </w:tc>
+        <w:tc>
+          <w:tcPr>
+            <w:tcW w:type="dxa" w:w="1170"/>
+          </w:tcPr>
+          <w:p>
+            <w:pPr>
+              <w:spacing w:before="60" w:after="60"/>
+            </w:pPr>
+            <w:r/>
+            <w:r>
+              <w:rPr>
+                <w:b/>
+              </w:rPr>
+              <w:t>57.14%</w:t>
+            </w:r>
+          </w:p>
+        </w:tc>
+        <w:tc>
+          <w:tcPr>
+            <w:tcW w:type="dxa" w:w="1170"/>
+          </w:tcPr>
+          <w:p>
+            <w:pPr>
+              <w:spacing w:before="60" w:after="60"/>
+            </w:pPr>
+            <w:r/>
+            <w:r>
+              <w:rPr>
+                <w:b/>
+              </w:rPr>
+              <w:t>28</w:t>
+            </w:r>
+          </w:p>
+        </w:tc>
+        <w:tc>
+          <w:tcPr>
+            <w:tcW w:type="dxa" w:w="1170"/>
+          </w:tcPr>
+          <w:p>
+            <w:pPr>
+              <w:spacing w:before="60" w:after="60"/>
+            </w:pPr>
+            <w:r/>
+            <w:r>
+              <w:rPr>
+                <w:b/>
+              </w:rPr>
+              <w:t>37.78%</w:t>
+            </w:r>
+          </w:p>
+        </w:tc>
+      </w:tr>
+    </w:tbl>
+    <w:p/>
+    <w:p>
+      <w:pPr>
+        <w:pStyle w:val="Heading4"/>
+      </w:pPr>
+      <w:r>
+        <w:t>Empirical Analysis of DPCS Operational Boundaries</w:t>
+      </w:r>
+    </w:p>
+    <w:p>
+      <w:r>
+        <w:t xml:space="preserve">As revealed by Table XI, DPCS credibility weighting is </w:t>
+      </w:r>
+      <w:r>
+        <w:rPr>
+          <w:b/>
+        </w:rPr>
+        <w:t>not uniformly beneficial across all gate operating points</w:t>
+      </w:r>
+      <w:r>
+        <w:t>:</w:t>
+      </w:r>
+    </w:p>
+    <w:p>
+      <w:pPr>
+        <w:pStyle w:val="ListNumber"/>
+      </w:pPr>
+      <w:r>
+        <w:rPr>
+          <w:b/>
+        </w:rPr>
+        <w:t>At the Deployed Production Threshold ($\tau = 0.22$):</w:t>
+      </w:r>
+      <w:r>
+        <w:t xml:space="preserve"> DPCS provides a pure efficiency gain. By suppressing lower-credibility candidate matches that score near the margin, DPCS reduces total LLM calls from 13 to 10 (</w:t>
+      </w:r>
+      <w:r>
+        <w:rPr>
+          <w:b/>
+        </w:rPr>
+        <w:t>77.78% call savings vs. 71.11%</w:t>
+      </w:r>
+      <w:r>
+        <w:t xml:space="preserve">) with </w:t>
+      </w:r>
+      <w:r>
+        <w:rPr>
+          <w:b/>
+        </w:rPr>
+        <w:t>zero accuracy or recall penalty</w:t>
+      </w:r>
+      <w:r>
+        <w:t xml:space="preserve"> (73.33% Acc, 35.29% Recall).</w:t>
+      </w:r>
+    </w:p>
+    <w:p>
+      <w:pPr>
+        <w:pStyle w:val="ListNumber"/>
+      </w:pPr>
+      <w:r>
+        <w:rPr>
+          <w:b/>
+        </w:rPr>
+        <w:t>At Lower Operating Thresholds ($\tau \le 0.18$):</w:t>
+      </w:r>
+      <w:r>
+        <w:t xml:space="preserve"> DPCS actively suppresses recall. At </w:t>
+      </w:r>
+      <w:r>
+        <w:rPr>
+          <w:rFonts w:ascii="Cambria Math" w:hAnsi="Cambria Math"/>
+          <w:i/>
+        </w:rPr>
+        <w:t>\tau = 0.18</w:t>
+      </w:r>
+      <w:r>
+        <w:t xml:space="preserve">, integrating DPCS into EFSA reduces recall from </w:t>
+      </w:r>
+      <w:r>
+        <w:rPr>
+          <w:b/>
+        </w:rPr>
+        <w:t>52.94% to 41.18%</w:t>
+      </w:r>
+      <w:r>
+        <w:t xml:space="preserve"> (true positive matches drop from 9 to 7 out of 17), because publisher credibility suppression filters out genuine same-event breaking reports from secondary or lower-scoring wire feeds before they can reach Stage 2 LLM verification.</w:t>
+      </w:r>
+    </w:p>
+    <w:p>
+      <w:r>
+        <w:rPr>
+          <w:i/>
+        </w:rPr>
+        <w:t>Empirical Conclusion:</w:t>
+      </w:r>
+      <w:r>
+        <w:t xml:space="preserve"> DPCS's dynamic suppression acts as a double-edged sword. For cost-optimized deployments operating at conservative gating thresholds (</w:t>
+      </w:r>
+      <w:r>
+        <w:rPr>
+          <w:rFonts w:ascii="Cambria Math" w:hAnsi="Cambria Math"/>
+          <w:i/>
+        </w:rPr>
+        <w:t>\tau = 0.22</w:t>
+      </w:r>
+      <w:r>
+        <w:t>), DPCS delivers additional LLM call savings without compromising accuracy. For high-recall deployments operating at permissive thresholds (</w:t>
+      </w:r>
+      <w:r>
+        <w:rPr>
+          <w:rFonts w:ascii="Cambria Math" w:hAnsi="Cambria Math"/>
+          <w:i/>
+        </w:rPr>
+        <w:t>\tau \le 0.18</w:t>
+      </w:r>
+      <w:r>
+        <w:t>), DPCS over-suppresses secondary wire sources, trading true positive recall for marginal call reductions. We state this explicit operational boundary to provide a complete, transparent evaluation of DPCS.</w:t>
       </w:r>
     </w:p>
     <w:p>

</xml_diff>

<commit_message>
docs(ieee-paper): nest Threats to Validity as Section 5.8 within Evaluation section
</commit_message>
<xml_diff>
--- a/docs/ieee_paper_final__dasan__v3.docx
+++ b/docs/ieee_paper_final__dasan__v3.docx
@@ -13179,15 +13179,15 @@
     </w:p>
     <w:p>
       <w:pPr>
-        <w:pStyle w:val="Heading2"/>
+        <w:pStyle w:val="Heading3"/>
       </w:pPr>
       <w:r>
-        <w:t>VI. THREATS TO VALIDITY</w:t>
+        <w:t>5.8 Threats to Validity</w:t>
       </w:r>
     </w:p>
     <w:p>
       <w:r>
-        <w:t>Before concluding, we explicitly document six methodological and operational threats to validity:</w:t>
+        <w:t>Before concluding the experimental evaluation, we explicitly document six methodological, construct, and operational threats to validity affecting our empirical findings:</w:t>
       </w:r>
     </w:p>
     <w:p>
@@ -13198,7 +13198,7 @@
         <w:rPr>
           <w:b/>
         </w:rPr>
-        <w:t>Benchmark Scale &amp; Single-Annotator Labeling:</w:t>
+        <w:t>Internal Validity (Benchmark Scale &amp; Single-Annotator Labeling):</w:t>
       </w:r>
       <w:r>
         <w:t xml:space="preserve"> The </w:t>
@@ -13211,7 +13211,17 @@
         <w:t>N=45</w:t>
       </w:r>
       <w:r>
-        <w:t xml:space="preserve"> evaluation dataset represents a modest, single-annotator-labeled benchmark collected over a 6-week wire window. Inter-annotator agreement metrics were not formally measured on a multi-annotator panel.</w:t>
+        <w:t xml:space="preserve"> evaluation dataset represents a modest, single-annotator-labeled benchmark collected over a 6-week wire window. Inter-annotator agreement metrics (</w:t>
+      </w:r>
+      <w:r>
+        <w:rPr>
+          <w:rFonts w:ascii="Cambria Math" w:hAnsi="Cambria Math"/>
+          <w:i/>
+        </w:rPr>
+        <w:t>\kappa</w:t>
+      </w:r>
+      <w:r>
+        <w:t>) were not formally measured on a multi-annotator panel.</w:t>
       </w:r>
     </w:p>
     <w:p>
@@ -13222,7 +13232,7 @@
         <w:rPr>
           <w:b/>
         </w:rPr>
-        <w:t>Evaluation Scale vs. Enterprise Corpora:</w:t>
+        <w:t>External Validity (Evaluation Scale vs. Enterprise Corpora):</w:t>
       </w:r>
       <w:r>
         <w:t xml:space="preserve"> While NISE is evaluated against live RSS wire streams, we do not present direct empirical comparisons against large-scale static databases such as GDELT or Event Registry at their full operating volume (</w:t>
@@ -13246,7 +13256,7 @@
         <w:rPr>
           <w:b/>
         </w:rPr>
-        <w:t>Unvalidated Sub-Components:</w:t>
+        <w:t>Construct Validity (Unvalidated Sub-Components):</w:t>
       </w:r>
       <w:r>
         <w:t xml:space="preserve"> The stance-detection agent and factuality reflection loop are fully implemented and operational in code, but their isolated classification accuracy has not been benchmarked against dedicated domain datasets (e.g., BASIL for stance annotation or FACTS Grounding for hallucination evaluation).</w:t>
@@ -13260,7 +13270,7 @@
         <w:rPr>
           <w:b/>
         </w:rPr>
-        <w:t>Legal Status of Transformative Rewriting:</w:t>
+        <w:t>Operational &amp; Legal Validity (Transformative Rewriting Legal Status):</w:t>
       </w:r>
       <w:r>
         <w:t xml:space="preserve"> The copyright reduction strategy is a software design goal intended to minimize exposure through transformative rewriting. It does not constitute a legally guaranteed exemption under copyright law, acknowledging active 2025 litigation surrounding AI news summarization (e.g., </w:t>
@@ -13283,7 +13293,7 @@
         <w:rPr>
           <w:b/>
         </w:rPr>
-        <w:t>Experimental Threshold Selection on Evaluation Set:</w:t>
+        <w:t>Methodological Validity (Experimental Threshold Selection on Evaluation Set):</w:t>
       </w:r>
       <w:r>
         <w:t xml:space="preserve"> The semantic gate threshold (</w:t>
@@ -13317,7 +13327,7 @@
         <w:rPr>
           <w:b/>
         </w:rPr>
-        <w:t>Non-Uniform Credibility Suppression in DPCS:</w:t>
+        <w:t>Operational Validity (Non-Uniform Credibility Suppression in DPCS):</w:t>
       </w:r>
       <w:r>
         <w:t xml:space="preserve"> Dynamic publisher credibility weighting is not uniformly beneficial across all operating points. For example, at threshold </w:t>
@@ -13349,7 +13359,7 @@
         <w:pStyle w:val="Heading2"/>
       </w:pPr>
       <w:r>
-        <w:t>VII. CONCLUSION &amp; FUTURE WORK</w:t>
+        <w:t>VI. CONCLUSION &amp; FUTURE WORK</w:t>
       </w:r>
     </w:p>
     <w:p>
@@ -13458,7 +13468,7 @@
         <w:pStyle w:val="Heading2"/>
       </w:pPr>
       <w:r>
-        <w:t>VIII. REFERENCES</w:t>
+        <w:t>VII. REFERENCES</w:t>
       </w:r>
     </w:p>
     <w:p>

</xml_diff>